<commit_message>
Update landing pages with refined medical copy from DM letter
</commit_message>
<xml_diff>
--- a/public/assets/tournament_variant_16.docx
+++ b/public/assets/tournament_variant_16.docx
@@ -4,205 +4,63 @@
   <w:body>
     <w:p>
       <w:pPr>
-        <w:spacing w:after="40" w:line="252" w:lineRule="auto"/>
-      </w:pPr>
-    </w:p>
-    <w:tbl>
-      <w:tblPr>
-        <w:tblW w:type="auto" w:w="0"/>
-        <w:jc w:val="center"/>
-        <w:tblLook w:firstColumn="1" w:firstRow="1" w:lastColumn="0" w:lastRow="0" w:noHBand="0" w:noVBand="1" w:val="04A0"/>
-      </w:tblPr>
-      <w:tblGrid>
-        <w:gridCol w:w="5162"/>
-        <w:gridCol w:w="5162"/>
-      </w:tblGrid>
-      <w:tr>
-        <w:tc>
-          <w:tcPr>
-            <w:tcW w:type="dxa" w:w="5184"/>
-            <w:shd w:fill="0F172A"/>
-            <w:tcMar>
-              <w:top w:w="60" w:type="dxa"/>
-              <w:bottom w:w="60" w:type="dxa"/>
-              <w:left w:w="100" w:type="dxa"/>
-              <w:right w:w="100" w:type="dxa"/>
-            </w:tcMar>
-          </w:tcPr>
-          <w:p>
-            <w:pPr>
-              <w:spacing w:after="0"/>
-            </w:pPr>
-            <w:r>
-              <w:rPr>
-                <w:rFonts w:ascii="맑은 고딕" w:hAnsi="맑은 고딕" w:eastAsia="맑은 고딕"/>
-                <w:b/>
-                <w:i w:val="0"/>
-                <w:color w:val="FFFFFF"/>
-                <w:sz w:val="17"/>
-              </w:rPr>
-              <w:t>Veterinary Exclusive · Wave 1 DM</w:t>
-            </w:r>
-          </w:p>
-        </w:tc>
-        <w:tc>
-          <w:tcPr>
-            <w:tcW w:type="dxa" w:w="5040"/>
-            <w:tcMar>
-              <w:top w:w="60" w:type="dxa"/>
-              <w:bottom w:w="60" w:type="dxa"/>
-              <w:left w:w="100" w:type="dxa"/>
-              <w:right w:w="100" w:type="dxa"/>
-            </w:tcMar>
-          </w:tcPr>
-          <w:p>
-            <w:pPr>
-              <w:spacing w:after="0"/>
-              <w:jc w:val="right"/>
-            </w:pPr>
-            <w:r>
-              <w:rPr>
-                <w:rFonts w:ascii="맑은 고딕" w:hAnsi="맑은 고딕" w:eastAsia="맑은 고딕"/>
-                <w:b/>
-                <w:i w:val="0"/>
-                <w:color w:val="00513B"/>
-                <w:sz w:val="18"/>
-              </w:rPr>
-              <w:t>공문번호: S&amp;J-2026-07-W1</w:t>
-            </w:r>
-          </w:p>
-        </w:tc>
-      </w:tr>
-    </w:tbl>
-    <w:p>
-      <w:pPr>
-        <w:spacing w:before="160" w:after="80"/>
-        <w:jc w:val="left"/>
+        <w:spacing w:after="40"/>
+        <w:jc w:val="right"/>
       </w:pPr>
       <w:r>
         <w:rPr>
           <w:rFonts w:ascii="맑은 고딕" w:hAnsi="맑은 고딕" w:eastAsia="맑은 고딕"/>
           <w:b/>
-          <w:i w:val="0"/>
-          <w:color w:val="0F172A"/>
-          <w:sz w:val="30"/>
+          <w:color w:val="00513B"/>
+          <w:sz w:val="18"/>
         </w:rPr>
-        <w:t>에스앤제이(S&amp;J) 동물병원 학술마케팅부 공식 초청 서신</w:t>
+        <w:t xml:space="preserve">[Veterinary Exclusive · Wave 1 DM]  </w:t>
+      </w:r>
+      <w:r>
+        <w:rPr>
+          <w:rFonts w:ascii="맑은 고딕" w:hAnsi="맑은 고딕" w:eastAsia="맑은 고딕"/>
+          <w:b/>
+          <w:color w:val="475569"/>
+          <w:sz w:val="18"/>
+        </w:rPr>
+        <w:t>발신: 에스앤제이(S&amp;J) 동물병원 (대표: 홍순일 원장)</w:t>
+        <w:br/>
+        <w:t>수신: 전국 소동물병원 원장님 귀하</w:t>
       </w:r>
     </w:p>
-    <w:tbl>
-      <w:tblPr>
-        <w:tblW w:type="auto" w:w="0"/>
-        <w:jc w:val="center"/>
-        <w:tblLook w:firstColumn="1" w:firstRow="1" w:lastColumn="0" w:lastRow="0" w:noHBand="0" w:noVBand="1" w:val="04A0"/>
-      </w:tblPr>
-      <w:tblGrid>
-        <w:gridCol w:w="5162"/>
-        <w:gridCol w:w="5162"/>
-      </w:tblGrid>
-      <w:tr>
-        <w:tc>
-          <w:tcPr>
-            <w:tcW w:type="dxa" w:w="5112"/>
-            <w:shd w:fill="F8FAFC"/>
-            <w:tcMar>
-              <w:top w:w="80" w:type="dxa"/>
-              <w:bottom w:w="80" w:type="dxa"/>
-              <w:left w:w="100" w:type="dxa"/>
-              <w:right w:w="100" w:type="dxa"/>
-            </w:tcMar>
-          </w:tcPr>
-          <w:p>
-            <w:pPr>
-              <w:spacing w:after="0"/>
-            </w:pPr>
-            <w:r>
-              <w:rPr>
-                <w:rFonts w:ascii="맑은 고딕" w:hAnsi="맑은 고딕" w:eastAsia="맑은 고딕"/>
-                <w:b/>
-                <w:i w:val="0"/>
-                <w:color w:val="00513B"/>
-                <w:sz w:val="17"/>
-              </w:rPr>
-              <w:t xml:space="preserve">[발신] </w:t>
-            </w:r>
-            <w:r>
-              <w:rPr>
-                <w:rFonts w:ascii="맑은 고딕" w:hAnsi="맑은 고딕" w:eastAsia="맑은 고딕"/>
-                <w:b w:val="0"/>
-                <w:i w:val="0"/>
-                <w:color w:val="1E293B"/>
-                <w:sz w:val="18"/>
-              </w:rPr>
-              <w:t>에스앤제이(S&amp;J) 동물병원 (대표: 홍순일 원장)</w:t>
-            </w:r>
-          </w:p>
-        </w:tc>
-        <w:tc>
-          <w:tcPr>
-            <w:tcW w:type="dxa" w:w="5112"/>
-            <w:shd w:fill="F8FAFC"/>
-            <w:tcMar>
-              <w:top w:w="80" w:type="dxa"/>
-              <w:bottom w:w="80" w:type="dxa"/>
-              <w:left w:w="100" w:type="dxa"/>
-              <w:right w:w="100" w:type="dxa"/>
-            </w:tcMar>
-          </w:tcPr>
-          <w:p>
-            <w:pPr>
-              <w:spacing w:after="0"/>
-              <w:jc w:val="right"/>
-            </w:pPr>
-            <w:r>
-              <w:rPr>
-                <w:rFonts w:ascii="맑은 고딕" w:hAnsi="맑은 고딕" w:eastAsia="맑은 고딕"/>
-                <w:b/>
-                <w:i w:val="0"/>
-                <w:color w:val="D97706"/>
-                <w:sz w:val="17"/>
-              </w:rPr>
-              <w:t xml:space="preserve">[수신] </w:t>
-            </w:r>
-            <w:r>
-              <w:rPr>
-                <w:rFonts w:ascii="맑은 고딕" w:hAnsi="맑은 고딕" w:eastAsia="맑은 고딕"/>
-                <w:b/>
-                <w:i w:val="0"/>
-                <w:color w:val="00513B"/>
-                <w:sz w:val="18"/>
-              </w:rPr>
-              <w:t>전국 소동물병원 원장님 귀하</w:t>
-            </w:r>
-          </w:p>
-        </w:tc>
-      </w:tr>
-    </w:tbl>
     <w:p>
       <w:pPr>
-        <w:spacing w:before="80" w:after="160"/>
+        <w:spacing w:after="120"/>
       </w:pPr>
       <w:r>
         <w:rPr>
           <w:rFonts w:ascii="맑은 고딕" w:hAnsi="맑은 고딕" w:eastAsia="맑은 고딕"/>
           <w:b/>
-          <w:i w:val="0"/>
           <w:color w:val="00513B"/>
-          <w:sz w:val="18"/>
+          <w:sz w:val="21"/>
         </w:rPr>
-        <w:t>――――――――――――――――――――――――――――――――――――――――――――――――――――</w:t>
+        <w:t>――――――――――――――――――――――――――――――――――――――――――――――――</w:t>
       </w:r>
     </w:p>
     <w:p>
       <w:pPr>
-        <w:spacing w:after="200" w:line="288" w:lineRule="auto"/>
+        <w:spacing w:after="160" w:line="276" w:lineRule="auto"/>
         <w:jc w:val="center"/>
       </w:pPr>
       <w:r>
         <w:rPr>
           <w:rFonts w:ascii="맑은 고딕" w:hAnsi="맑은 고딕" w:eastAsia="맑은 고딕"/>
           <w:b/>
-          <w:i w:val="0"/>
+          <w:color w:val="0F172A"/>
+          <w:sz w:val="28"/>
+        </w:rPr>
+        <w:t>에스앤제이(S&amp;J) 동물병원 학술마케팅부 공식 초청 서신</w:t>
+        <w:br/>
+      </w:r>
+      <w:r>
+        <w:rPr>
+          <w:rFonts w:ascii="맑은 고딕" w:hAnsi="맑은 고딕" w:eastAsia="맑은 고딕"/>
+          <w:b/>
           <w:color w:val="00513B"/>
           <w:sz w:val="23"/>
         </w:rPr>
@@ -213,15 +71,14 @@
     </w:p>
     <w:p>
       <w:pPr>
-        <w:spacing w:after="120" w:line="283" w:lineRule="auto"/>
+        <w:spacing w:after="200" w:line="276" w:lineRule="auto"/>
       </w:pPr>
       <w:r>
         <w:rPr>
           <w:rFonts w:ascii="맑은 고딕" w:hAnsi="맑은 고딕" w:eastAsia="맑은 고딕"/>
           <w:b/>
-          <w:i w:val="0"/>
           <w:color w:val="0F172A"/>
-          <w:sz w:val="19"/>
+          <w:sz w:val="20"/>
         </w:rPr>
         <w:t>존경하는 원장님, 안녕하십니까.</w:t>
         <w:br/>
@@ -230,30 +87,19 @@
         <w:rPr>
           <w:rFonts w:ascii="맑은 고딕" w:hAnsi="맑은 고딕" w:eastAsia="맑은 고딕"/>
           <w:b w:val="0"/>
-          <w:i w:val="0"/>
           <w:color w:val="1E293B"/>
-          <w:sz w:val="19"/>
+          <w:sz w:val="20"/>
         </w:rPr>
         <w:t>진료 현장에서 파보·로타·코로나 등 중증 바이러스성 장염 및 설사 환축 치료 시, 장내 수분·독소·바이러스를 강력히 흡착해 설사를 멎게 하고 손상된 위장 점막을 효과적으로 보호하는 천연 점토(스멕타이트/몬모릴로나이트) 성분 흡착성 지사제 솔루션의 필요성을 잘 알고 계실 것입니다.</w:t>
         <w:br/>
-      </w:r>
-      <w:r>
-        <w:rPr>
-          <w:rFonts w:ascii="맑은 고딕" w:hAnsi="맑은 고딕" w:eastAsia="맑은 고딕"/>
-          <w:b w:val="0"/>
-          <w:i w:val="0"/>
-          <w:color w:val="1E293B"/>
-          <w:sz w:val="19"/>
-        </w:rPr>
         <w:t xml:space="preserve">이에 에스앤제이(S&amp;J) 동물병원은 (전)서울대학교 수의과대학 출신 자문단과 함께, </w:t>
       </w:r>
       <w:r>
         <w:rPr>
           <w:rFonts w:ascii="맑은 고딕" w:hAnsi="맑은 고딕" w:eastAsia="맑은 고딕"/>
           <w:b/>
-          <w:i w:val="0"/>
           <w:color w:val="00513B"/>
-          <w:sz w:val="19"/>
+          <w:sz w:val="20"/>
         </w:rPr>
         <w:t>약 6,000례의 임상 경험을 기반으로 설계된 소동물 전용 천연 고미립 장내 유해물질 흡착·제거 보조제 『몬스멕타(MONSMECTA)』</w:t>
       </w:r>
@@ -261,9 +107,8 @@
         <w:rPr>
           <w:rFonts w:ascii="맑은 고딕" w:hAnsi="맑은 고딕" w:eastAsia="맑은 고딕"/>
           <w:b w:val="0"/>
-          <w:i w:val="0"/>
           <w:color w:val="1E293B"/>
-          <w:sz w:val="19"/>
+          <w:sz w:val="20"/>
         </w:rPr>
         <w:t>를 공식 런칭하고 전국 5,000개 동물병원 원장님들께 특별 우선 배포를 제안드립니다.</w:t>
       </w:r>
@@ -275,52 +120,50 @@
         <w:tblLook w:firstColumn="1" w:firstRow="1" w:lastColumn="0" w:lastRow="0" w:noHBand="0" w:noVBand="1" w:val="04A0"/>
       </w:tblPr>
       <w:tblGrid>
-        <w:gridCol w:w="10325"/>
+        <w:gridCol w:w="10209"/>
       </w:tblGrid>
       <w:tr>
         <w:tc>
           <w:tcPr>
-            <w:tcW w:type="dxa" w:w="10224"/>
-            <w:shd w:fill="F8FAFC"/>
+            <w:tcW w:type="dxa" w:w="10210"/>
+            <w:shd w:fill="F0FDF4"/>
+            <w:tcBorders>
+              <w:top w:val="single" w:sz="12" w:space="0" w:color="00513B"/>
+              <w:left w:val="single" w:sz="12" w:space="0" w:color="00513B"/>
+              <w:bottom w:val="single" w:sz="12" w:space="0" w:color="00513B"/>
+              <w:right w:val="single" w:sz="12" w:space="0" w:color="00513B"/>
+            </w:tcBorders>
             <w:tcMar>
-              <w:top w:w="100" w:type="dxa"/>
-              <w:bottom w:w="100" w:type="dxa"/>
-              <w:left w:w="140" w:type="dxa"/>
-              <w:right w:w="140" w:type="dxa"/>
+              <w:top w:w="140" w:type="dxa"/>
+              <w:bottom w:w="140" w:type="dxa"/>
+              <w:left w:w="180" w:type="dxa"/>
+              <w:right w:w="180" w:type="dxa"/>
             </w:tcMar>
-            <w:tcBorders>
-              <w:top w:val="none"/>
-              <w:bottom w:val="none"/>
-              <w:left w:val="single" w:sz="12" w:space="0" w:color="0F172A"/>
-              <w:right w:val="none"/>
-            </w:tcBorders>
           </w:tcPr>
           <w:p>
             <w:pPr>
-              <w:spacing w:after="80"/>
+              <w:spacing w:after="120"/>
             </w:pPr>
             <w:r>
               <w:rPr>
                 <w:rFonts w:ascii="맑은 고딕" w:hAnsi="맑은 고딕" w:eastAsia="맑은 고딕"/>
                 <w:b/>
-                <w:i w:val="0"/>
                 <w:color w:val="00513B"/>
-                <w:sz w:val="19"/>
+                <w:sz w:val="20"/>
               </w:rPr>
               <w:t>■ 바이러스학 분야 권위자 및 임상 자문단 검증 코멘트</w:t>
             </w:r>
           </w:p>
           <w:p>
             <w:pPr>
-              <w:spacing w:after="60" w:line="269" w:lineRule="auto"/>
+              <w:spacing w:after="80" w:line="269" w:lineRule="auto"/>
             </w:pPr>
             <w:r>
               <w:rPr>
                 <w:rFonts w:ascii="맑은 고딕" w:hAnsi="맑은 고딕" w:eastAsia="맑은 고딕"/>
                 <w:b/>
-                <w:i w:val="0"/>
                 <w:color w:val="0F172A"/>
-                <w:sz w:val="17"/>
+                <w:sz w:val="19"/>
               </w:rPr>
               <w:t xml:space="preserve">[바이러스학] 박봉균 교수 (전 농림축산검역본부장, 바이러스학 분야 권위자): </w:t>
             </w:r>
@@ -328,24 +171,22 @@
               <w:rPr>
                 <w:rFonts w:ascii="맑은 고딕" w:hAnsi="맑은 고딕" w:eastAsia="맑은 고딕"/>
                 <w:b w:val="0"/>
-                <w:i w:val="0"/>
-                <w:color w:val="475569"/>
-                <w:sz w:val="17"/>
+                <w:color w:val="334155"/>
+                <w:sz w:val="19"/>
               </w:rPr>
               <w:t>“일반 지사제와 달리 1-Deoxynojirimycin(DNJ)의 여러 바이러스 억제 효과와 차별화된 장내 유해물질 흡착력은 임상 진료에서 매우 강력한 강점입니다.”</w:t>
             </w:r>
           </w:p>
           <w:p>
             <w:pPr>
-              <w:spacing w:after="60" w:line="269" w:lineRule="auto"/>
+              <w:spacing w:after="80" w:line="269" w:lineRule="auto"/>
             </w:pPr>
             <w:r>
               <w:rPr>
                 <w:rFonts w:ascii="맑은 고딕" w:hAnsi="맑은 고딕" w:eastAsia="맑은 고딕"/>
                 <w:b/>
-                <w:i w:val="0"/>
                 <w:color w:val="0F172A"/>
-                <w:sz w:val="17"/>
+                <w:sz w:val="19"/>
               </w:rPr>
               <w:t xml:space="preserve">[임상검증] 정성대 원장 (동진동물병원 원장): </w:t>
             </w:r>
@@ -353,24 +194,22 @@
               <w:rPr>
                 <w:rFonts w:ascii="맑은 고딕" w:hAnsi="맑은 고딕" w:eastAsia="맑은 고딕"/>
                 <w:b w:val="0"/>
-                <w:i w:val="0"/>
-                <w:color w:val="475569"/>
-                <w:sz w:val="17"/>
+                <w:color w:val="334155"/>
+                <w:sz w:val="19"/>
               </w:rPr>
               <w:t>“입자도, 수분 흡수율, 비표면적... 수의사가 진료실에서 처방할 때 가장 알고 싶어 하는 정확한 물성 데이터가 완벽하게 규명되었습니다.”</w:t>
             </w:r>
           </w:p>
           <w:p>
             <w:pPr>
-              <w:spacing w:after="60" w:line="269" w:lineRule="auto"/>
+              <w:spacing w:after="80" w:line="269" w:lineRule="auto"/>
             </w:pPr>
             <w:r>
               <w:rPr>
                 <w:rFonts w:ascii="맑은 고딕" w:hAnsi="맑은 고딕" w:eastAsia="맑은 고딕"/>
                 <w:b/>
-                <w:i w:val="0"/>
                 <w:color w:val="0F172A"/>
-                <w:sz w:val="17"/>
+                <w:sz w:val="19"/>
               </w:rPr>
               <w:t xml:space="preserve">[회복단축] 김동준 원장 (사랑동물병원 원장): </w:t>
             </w:r>
@@ -378,9 +217,8 @@
               <w:rPr>
                 <w:rFonts w:ascii="맑은 고딕" w:hAnsi="맑은 고딕" w:eastAsia="맑은 고딕"/>
                 <w:b w:val="0"/>
-                <w:i w:val="0"/>
-                <w:color w:val="475569"/>
-                <w:sz w:val="17"/>
+                <w:color w:val="334155"/>
+                <w:sz w:val="19"/>
               </w:rPr>
               <w:t>“정맥 수액(IV) 처치와 병행 투여 시, 장점막을 이중 보호하고 전해질 밸런스를 맞춰 파보 장염 환축의 증상 회복 기간 단축에 큰 도움을 줍니다.”</w:t>
             </w:r>
@@ -388,6 +226,11 @@
         </w:tc>
       </w:tr>
     </w:tbl>
+    <w:p>
+      <w:pPr>
+        <w:spacing w:before="160" w:after="160"/>
+      </w:pPr>
+    </w:p>
     <w:tbl>
       <w:tblPr>
         <w:tblW w:type="auto" w:w="0"/>
@@ -395,38 +238,37 @@
         <w:tblLook w:firstColumn="1" w:firstRow="1" w:lastColumn="0" w:lastRow="0" w:noHBand="0" w:noVBand="1" w:val="04A0"/>
       </w:tblPr>
       <w:tblGrid>
-        <w:gridCol w:w="10325"/>
+        <w:gridCol w:w="10209"/>
       </w:tblGrid>
       <w:tr>
         <w:tc>
           <w:tcPr>
-            <w:tcW w:type="dxa" w:w="10224"/>
-            <w:shd w:fill="FFFBEB"/>
+            <w:tcW w:type="dxa" w:w="10210"/>
+            <w:shd w:fill="F0FDF4"/>
+            <w:tcBorders>
+              <w:top w:val="single" w:sz="12" w:space="0" w:color="00513B"/>
+              <w:left w:val="single" w:sz="12" w:space="0" w:color="00513B"/>
+              <w:bottom w:val="single" w:sz="12" w:space="0" w:color="00513B"/>
+              <w:right w:val="single" w:sz="12" w:space="0" w:color="00513B"/>
+            </w:tcBorders>
             <w:tcMar>
-              <w:top w:w="90" w:type="dxa"/>
-              <w:bottom w:w="90" w:type="dxa"/>
-              <w:left w:w="120" w:type="dxa"/>
-              <w:right w:w="120" w:type="dxa"/>
+              <w:top w:w="140" w:type="dxa"/>
+              <w:bottom w:w="140" w:type="dxa"/>
+              <w:left w:w="160" w:type="dxa"/>
+              <w:right w:w="160" w:type="dxa"/>
             </w:tcMar>
-            <w:tcBorders>
-              <w:top w:val="single" w:sz="6" w:space="0" w:color="D97706"/>
-              <w:bottom w:val="single" w:sz="6" w:space="0" w:color="D97706"/>
-              <w:left w:val="single" w:sz="6" w:space="0" w:color="D97706"/>
-              <w:right w:val="single" w:sz="6" w:space="0" w:color="D97706"/>
-            </w:tcBorders>
           </w:tcPr>
           <w:p>
             <w:pPr>
-              <w:spacing w:after="60"/>
+              <w:spacing w:after="120" w:line="276" w:lineRule="auto"/>
               <w:jc w:val="center"/>
             </w:pPr>
             <w:r>
               <w:rPr>
                 <w:rFonts w:ascii="맑은 고딕" w:hAnsi="맑은 고딕" w:eastAsia="맑은 고딕"/>
                 <w:b/>
-                <w:i w:val="0"/>
-                <w:color w:val="D97706"/>
-                <w:sz w:val="18"/>
+                <w:color w:val="00513B"/>
+                <w:sz w:val="20"/>
               </w:rPr>
               <w:t xml:space="preserve">[Wave 1 초도 양산 한정 선착순 우선 공급] </w:t>
             </w:r>
@@ -434,9 +276,8 @@
               <w:rPr>
                 <w:rFonts w:ascii="맑은 고딕" w:hAnsi="맑은 고딕" w:eastAsia="맑은 고딕"/>
                 <w:b/>
-                <w:i w:val="0"/>
                 <w:color w:val="0F172A"/>
-                <w:sz w:val="20"/>
+                <w:sz w:val="21"/>
               </w:rPr>
               <w:t>전국 소동물병원 5,000처 중 단 170개 병원 선착순 배포</w:t>
               <w:br/>
@@ -445,11 +286,10 @@
               <w:rPr>
                 <w:rFonts w:ascii="맑은 고딕" w:hAnsi="맑은 고딕" w:eastAsia="맑은 고딕"/>
                 <w:b w:val="0"/>
-                <w:i w:val="0"/>
                 <w:color w:val="475569"/>
-                <w:sz w:val="17"/>
+                <w:sz w:val="18"/>
               </w:rPr>
-              <w:t>스마트폰 카메라로 아래 QR코드를 스캔하시면 1초 만에 접수 및 학술 데이터 열람이 가능합니다.</w:t>
+              <w:t>복잡한 주소 입력 없이 스마트폰 카메라로 아래 QR코드를 스캔하시면 1초 만에 접수 및 학술 데이터 열람이 가능합니다.</w:t>
             </w:r>
           </w:p>
           <w:tbl>
@@ -459,30 +299,36 @@
               <w:tblLook w:firstColumn="1" w:firstRow="1" w:lastColumn="0" w:lastRow="0" w:noHBand="0" w:noVBand="1" w:val="04A0"/>
             </w:tblPr>
             <w:tblGrid>
-              <w:gridCol w:w="5112"/>
-              <w:gridCol w:w="5112"/>
+              <w:gridCol w:w="5105"/>
+              <w:gridCol w:w="5105"/>
             </w:tblGrid>
             <w:tr>
               <w:tc>
                 <w:tcPr>
                   <w:tcW w:type="dxa" w:w="4824"/>
                   <w:shd w:fill="FFFFFF"/>
+                  <w:tcBorders>
+                    <w:top w:val="single" w:sz="6" w:space="0" w:color="00513B"/>
+                    <w:left w:val="single" w:sz="6" w:space="0" w:color="00513B"/>
+                    <w:bottom w:val="single" w:sz="6" w:space="0" w:color="00513B"/>
+                    <w:right w:val="single" w:sz="6" w:space="0" w:color="00513B"/>
+                  </w:tcBorders>
                   <w:tcMar>
-                    <w:top w:w="60" w:type="dxa"/>
-                    <w:bottom w:w="60" w:type="dxa"/>
-                    <w:left w:w="60" w:type="dxa"/>
-                    <w:right w:w="60" w:type="dxa"/>
+                    <w:top w:w="100" w:type="dxa"/>
+                    <w:bottom w:w="100" w:type="dxa"/>
+                    <w:left w:w="100" w:type="dxa"/>
+                    <w:right w:w="100" w:type="dxa"/>
                   </w:tcMar>
                 </w:tcPr>
                 <w:p>
                   <w:pPr>
-                    <w:spacing w:after="40"/>
+                    <w:spacing w:after="60"/>
                     <w:jc w:val="center"/>
                   </w:pPr>
                   <w:r>
                     <w:drawing>
                       <wp:inline xmlns:a="http://schemas.openxmlformats.org/drawingml/2006/main" xmlns:pic="http://schemas.openxmlformats.org/drawingml/2006/picture">
-                        <wp:extent cx="777240" cy="777240"/>
+                        <wp:extent cx="868680" cy="868680"/>
                         <wp:docPr id="1" name="Picture 1"/>
                         <wp:cNvGraphicFramePr>
                           <a:graphicFrameLocks noChangeAspect="1"/>
@@ -503,7 +349,7 @@
                               <pic:spPr>
                                 <a:xfrm>
                                   <a:off x="0" y="0"/>
-                                  <a:ext cx="777240" cy="777240"/>
+                                  <a:ext cx="868680" cy="868680"/>
                                 </a:xfrm>
                                 <a:prstGeom prst="rect"/>
                               </pic:spPr>
@@ -516,29 +362,37 @@
                 </w:p>
                 <w:p>
                   <w:pPr>
-                    <w:spacing w:after="0"/>
+                    <w:spacing w:after="0" w:line="269" w:lineRule="auto"/>
                     <w:jc w:val="center"/>
                   </w:pPr>
                   <w:r>
                     <w:rPr>
                       <w:rFonts w:ascii="맑은 고딕" w:hAnsi="맑은 고딕" w:eastAsia="맑은 고딕"/>
                       <w:b/>
-                      <w:i w:val="0"/>
                       <w:color w:val="00513B"/>
                       <w:sz w:val="17"/>
                     </w:rPr>
-                    <w:t>[QR 01] 초도 170세트 발주 접수</w:t>
+                    <w:t>[QR CODE 01]</w:t>
+                    <w:br/>
+                  </w:r>
+                  <w:r>
+                    <w:rPr>
+                      <w:rFonts w:ascii="맑은 고딕" w:hAnsi="맑은 고딕" w:eastAsia="맑은 고딕"/>
+                      <w:b/>
+                      <w:color w:val="0F172A"/>
+                      <w:sz w:val="18"/>
+                    </w:rPr>
+                    <w:t>📦 초도 170세트 발주 및 특별 접수 QR</w:t>
                     <w:br/>
                   </w:r>
                   <w:r>
                     <w:rPr>
                       <w:rFonts w:ascii="맑은 고딕" w:hAnsi="맑은 고딕" w:eastAsia="맑은 고딕"/>
                       <w:b w:val="0"/>
-                      <w:i w:val="0"/>
                       <w:color w:val="64748B"/>
-                      <w:sz w:val="15"/>
+                      <w:sz w:val="16"/>
                     </w:rPr>
-                    <w:t>스캔 시 즉시 병원 인증 및 접수</w:t>
+                    <w:t>카메라 스캔 시 즉시 병원 인증 및 접수</w:t>
                   </w:r>
                 </w:p>
               </w:tc>
@@ -546,22 +400,28 @@
                 <w:tcPr>
                   <w:tcW w:type="dxa" w:w="4824"/>
                   <w:shd w:fill="FFFFFF"/>
+                  <w:tcBorders>
+                    <w:top w:val="single" w:sz="6" w:space="0" w:color="00513B"/>
+                    <w:left w:val="single" w:sz="6" w:space="0" w:color="00513B"/>
+                    <w:bottom w:val="single" w:sz="6" w:space="0" w:color="00513B"/>
+                    <w:right w:val="single" w:sz="6" w:space="0" w:color="00513B"/>
+                  </w:tcBorders>
                   <w:tcMar>
-                    <w:top w:w="60" w:type="dxa"/>
-                    <w:bottom w:w="60" w:type="dxa"/>
-                    <w:left w:w="60" w:type="dxa"/>
-                    <w:right w:w="60" w:type="dxa"/>
+                    <w:top w:w="100" w:type="dxa"/>
+                    <w:bottom w:w="100" w:type="dxa"/>
+                    <w:left w:w="100" w:type="dxa"/>
+                    <w:right w:w="100" w:type="dxa"/>
                   </w:tcMar>
                 </w:tcPr>
                 <w:p>
                   <w:pPr>
-                    <w:spacing w:after="40"/>
+                    <w:spacing w:after="60"/>
                     <w:jc w:val="center"/>
                   </w:pPr>
                   <w:r>
                     <w:drawing>
                       <wp:inline xmlns:a="http://schemas.openxmlformats.org/drawingml/2006/main" xmlns:pic="http://schemas.openxmlformats.org/drawingml/2006/picture">
-                        <wp:extent cx="777240" cy="777240"/>
+                        <wp:extent cx="868680" cy="868680"/>
                         <wp:docPr id="2" name="Picture 2"/>
                         <wp:cNvGraphicFramePr>
                           <a:graphicFrameLocks noChangeAspect="1"/>
@@ -582,7 +442,7 @@
                               <pic:spPr>
                                 <a:xfrm>
                                   <a:off x="0" y="0"/>
-                                  <a:ext cx="777240" cy="777240"/>
+                                  <a:ext cx="868680" cy="868680"/>
                                 </a:xfrm>
                                 <a:prstGeom prst="rect"/>
                               </pic:spPr>
@@ -595,29 +455,37 @@
                 </w:p>
                 <w:p>
                   <w:pPr>
-                    <w:spacing w:after="0"/>
+                    <w:spacing w:after="0" w:line="269" w:lineRule="auto"/>
                     <w:jc w:val="center"/>
                   </w:pPr>
                   <w:r>
                     <w:rPr>
                       <w:rFonts w:ascii="맑은 고딕" w:hAnsi="맑은 고딕" w:eastAsia="맑은 고딕"/>
                       <w:b/>
-                      <w:i w:val="0"/>
-                      <w:color w:val="D97706"/>
+                      <w:color w:val="00513B"/>
                       <w:sz w:val="17"/>
                     </w:rPr>
-                    <w:t>[QR 02] 자문단 학술 데이터 및 시나리오</w:t>
+                    <w:t>[QR CODE 02]</w:t>
+                    <w:br/>
+                  </w:r>
+                  <w:r>
+                    <w:rPr>
+                      <w:rFonts w:ascii="맑은 고딕" w:hAnsi="맑은 고딕" w:eastAsia="맑은 고딕"/>
+                      <w:b/>
+                      <w:color w:val="0F172A"/>
+                      <w:sz w:val="18"/>
+                    </w:rPr>
+                    <w:t>📊 자문단 학술 데이터 및 시나리오 QR</w:t>
                     <w:br/>
                   </w:r>
                   <w:r>
                     <w:rPr>
                       <w:rFonts w:ascii="맑은 고딕" w:hAnsi="맑은 고딕" w:eastAsia="맑은 고딕"/>
                       <w:b w:val="0"/>
-                      <w:i w:val="0"/>
                       <w:color w:val="64748B"/>
-                      <w:sz w:val="15"/>
+                      <w:sz w:val="16"/>
                     </w:rPr>
-                    <w:t>(전)서울대 수의대 자문 데이터 열람</w:t>
+                    <w:t>(전)서울대 출신 자문단 데이터 및 상담 시나리오 열람</w:t>
                   </w:r>
                 </w:p>
               </w:tc>
@@ -635,41 +503,37 @@
       <w:r>
         <w:rPr>
           <w:rFonts w:ascii="맑은 고딕" w:hAnsi="맑은 고딕" w:eastAsia="맑은 고딕"/>
+          <w:b w:val="0"/>
+          <w:color w:val="CBD5E1"/>
+          <w:sz w:val="17"/>
+        </w:rPr>
+        <w:t>――――――――――――――――――――――――――――――――――――――――――――――――</w:t>
+        <w:br/>
+      </w:r>
+      <w:r>
+        <w:rPr>
+          <w:rFonts w:ascii="맑은 고딕" w:hAnsi="맑은 고딕" w:eastAsia="맑은 고딕"/>
           <w:b/>
-          <w:i w:val="0"/>
-          <w:color w:val="0F172A"/>
-          <w:sz w:val="19"/>
+          <w:color w:val="334155"/>
+          <w:sz w:val="17"/>
         </w:rPr>
-        <w:t>에스앤제이(S&amp;J) 동물병원</w:t>
+        <w:t>에스앤제이(S&amp;J) 동물병원 | 대표: 홍순일 (닥터 젬스홍) | 사업자번호: 792-66-00615</w:t>
+        <w:br/>
+      </w:r>
+      <w:r>
+        <w:rPr>
+          <w:rFonts w:ascii="맑은 고딕" w:hAnsi="맑은 고딕" w:eastAsia="맑은 고딕"/>
+          <w:b/>
+          <w:color w:val="00513B"/>
+          <w:sz w:val="17"/>
+        </w:rPr>
+        <w:t>주소: 경기도 용인시 처인구 포곡읍 선장1로 98-8 | 대표 연락처: 031-321-6562 | 공식 이메일: soonilhong@naver.com</w:t>
         <w:br/>
       </w:r>
       <w:r>
         <w:rPr>
           <w:rFonts w:ascii="맑은 고딕" w:hAnsi="맑은 고딕" w:eastAsia="맑은 고딕"/>
           <w:b w:val="0"/>
-          <w:i w:val="0"/>
-          <w:color w:val="475569"/>
-          <w:sz w:val="16"/>
-        </w:rPr>
-        <w:t>대표: 홍순일 (닥터 젬스홍) | 사업자번호: 792-66-00615 | 주소: 경기도 용인시 처인구 포곡읍 선장1로 98-8</w:t>
-        <w:br/>
-      </w:r>
-      <w:r>
-        <w:rPr>
-          <w:rFonts w:ascii="맑은 고딕" w:hAnsi="맑은 고딕" w:eastAsia="맑은 고딕"/>
-          <w:b/>
-          <w:i w:val="0"/>
-          <w:color w:val="00513B"/>
-          <w:sz w:val="17"/>
-        </w:rPr>
-        <w:t>대표 연락처: 031-321-6562 | 공식 이메일: soonilhong@naver.com</w:t>
-        <w:br/>
-      </w:r>
-      <w:r>
-        <w:rPr>
-          <w:rFonts w:ascii="맑은 고딕" w:hAnsi="맑은 고딕" w:eastAsia="맑은 고딕"/>
-          <w:b w:val="0"/>
-          <w:i w:val="0"/>
           <w:color w:val="94A3B8"/>
           <w:sz w:val="15"/>
         </w:rPr>
@@ -678,7 +542,7 @@
     </w:p>
     <w:sectPr>
       <w:pgSz w:w="11909" w:h="16834"/>
-      <w:pgMar w:top="648" w:right="792" w:bottom="648" w:left="792" w:header="720" w:footer="720" w:gutter="0"/>
+      <w:pgMar w:top="677" w:right="850" w:bottom="677" w:left="850" w:header="720" w:footer="720" w:gutter="0"/>
       <w:cols w:space="720"/>
       <w:docGrid w:linePitch="360"/>
     </w:sectPr>

</xml_diff>